<commit_message>
feat(visualizer): improve floor rendering with adjacency checks
- Add all_elements parameter to render_floor_image for proper adjacency checks
- Extend debug logging to include first floor (z=0.0) elements
- Add new render_element_for_floor method for consistent floor element coloring
- Update analysis report with reordered element list
</commit_message>
<xml_diff>
--- a/rust/second_part/output/analysis_report.docx
+++ b/rust/second_part/output/analysis_report.docx
@@ -391,7 +391,7 @@
                     </pic:cNvPicPr>
                   </pic:nvPicPr>
                   <pic:blipFill>
-                    <a:blip r:embed="rIdImage4"/>
+                    <a:blip r:embed="rIdImage3"/>
                     <a:srcRect/>
                     <a:stretch>
                       <a:fillRect/>
@@ -1138,7 +1138,7 @@
           <w:sz w:val="12"/>
           <w:szCs w:val="12"/>
         </w:rPr>
-        <w:t xml:space="preserve">7989, 7512, 7990, 7988, 7513, 8423, 7514, 8422, 8424, 7036, 7037, 7991, 7515, 8425, 7038, 7039, 7516, 7992, 8426, 7040</w:t>
+        <w:t xml:space="preserve">8426, 8425, 7992, 7991, 7990, 8424, 7516, 7515, 7514, 8423, 7513, 7989, 7039, 7040, 7038, 7037, 8422, 7988, 7036, 7512</w:t>
       </w:r>
     </w:p>
     <w:p>

</xml_diff>